<commit_message>
Clarify pGen-SHM filters and pGen zero handling
</commit_message>
<xml_diff>
--- a/TSVからpGen-SHMデータ作成仕様書_20260607.docx
+++ b/TSVからpGen-SHMデータ作成仕様書_20260607.docx
@@ -1722,6 +1722,776 @@
         <w:t>将来的にはROIをGUIで設定可能にする、KDE bandwidthを複数出力する、V alignment length別の感度解析を追加する余地がある。</w:t>
       </w:r>
     </w:p>
+    <w:p>
+      <w:pPr>
+        <w:pStyle w:val="Heading1"/>
+      </w:pPr>
+      <w:r>
+        <w:rPr>
+          <w:color w:val="2E74B5"/>
+        </w:rPr>
+        <w:t>8. 解析フローと採用フィルタ</w:t>
+      </w:r>
+    </w:p>
+    <w:p>
+      <w:r>
+        <w:t>現在の解析フローは、マージした配列からIgBLAST AIRR TSVを作成し、そのAIRR TSVにフィルタを適用した後、採用row-level Excel/TSVを中心データとして保存する流れである。FASTAを本GUIへ直接入れるのではなく、前段でAIRR TSV化済みのデータを入力する。</w:t>
+      </w:r>
+    </w:p>
+    <w:tbl>
+      <w:tblPr>
+        <w:tblStyle w:val="TableGrid"/>
+        <w:tblW w:type="dxa" w:w="9360"/>
+        <w:tblLayout w:type="fixed"/>
+        <w:tblLook w:firstColumn="1" w:firstRow="1" w:lastColumn="0" w:lastRow="0" w:noHBand="0" w:noVBand="1" w:val="04A0"/>
+        <w:tblInd w:w="120" w:type="dxa"/>
+        <w:tblCellMar>
+          <w:top w:w="80" w:type="dxa"/>
+          <w:start w:w="120" w:type="dxa"/>
+          <w:bottom w:w="80" w:type="dxa"/>
+          <w:end w:w="120" w:type="dxa"/>
+        </w:tblCellMar>
+      </w:tblPr>
+      <w:tblGrid>
+        <w:gridCol w:w="1900"/>
+        <w:gridCol w:w="4200"/>
+        <w:gridCol w:w="3260"/>
+      </w:tblGrid>
+      <w:tr>
+        <w:tc>
+          <w:tcPr>
+            <w:tcW w:type="dxa" w:w="1900"/>
+            <w:vAlign w:val="center"/>
+            <w:shd w:fill="E8EEF5"/>
+          </w:tcPr>
+          <w:p>
+            <w:pPr>
+              <w:jc w:val="center"/>
+            </w:pPr>
+            <w:r>
+              <w:rPr>
+                <w:b/>
+                <w:color w:val="0B2545"/>
+              </w:rPr>
+              <w:t>段階</w:t>
+            </w:r>
+          </w:p>
+        </w:tc>
+        <w:tc>
+          <w:tcPr>
+            <w:tcW w:type="dxa" w:w="4200"/>
+            <w:vAlign w:val="center"/>
+            <w:shd w:fill="E8EEF5"/>
+          </w:tcPr>
+          <w:p>
+            <w:pPr>
+              <w:jc w:val="center"/>
+            </w:pPr>
+            <w:r>
+              <w:rPr>
+                <w:b/>
+                <w:color w:val="0B2545"/>
+              </w:rPr>
+              <w:t>処理内容</w:t>
+            </w:r>
+          </w:p>
+        </w:tc>
+        <w:tc>
+          <w:tcPr>
+            <w:tcW w:type="dxa" w:w="3260"/>
+            <w:vAlign w:val="center"/>
+            <w:shd w:fill="E8EEF5"/>
+          </w:tcPr>
+          <w:p>
+            <w:pPr>
+              <w:jc w:val="center"/>
+            </w:pPr>
+            <w:r>
+              <w:rPr>
+                <w:b/>
+                <w:color w:val="0B2545"/>
+              </w:rPr>
+              <w:t>主な出力・確認点</w:t>
+            </w:r>
+          </w:p>
+        </w:tc>
+      </w:tr>
+      <w:tr>
+        <w:tc>
+          <w:tcPr>
+            <w:tcW w:type="dxa" w:w="1900"/>
+          </w:tcPr>
+          <w:p>
+            <w:pPr>
+              <w:spacing w:after="40"/>
+            </w:pPr>
+            <w:r>
+              <w:t>1. merged sequence</w:t>
+            </w:r>
+          </w:p>
+        </w:tc>
+        <w:tc>
+          <w:tcPr>
+            <w:tcW w:type="dxa" w:w="4200"/>
+          </w:tcPr>
+          <w:p>
+            <w:pPr>
+              <w:spacing w:after="40"/>
+            </w:pPr>
+            <w:r>
+              <w:t>前段GUIまたは別工程でマージ済み配列を作成する。</w:t>
+            </w:r>
+          </w:p>
+        </w:tc>
+        <w:tc>
+          <w:tcPr>
+            <w:tcW w:type="dxa" w:w="3260"/>
+          </w:tcPr>
+          <w:p>
+            <w:pPr>
+              <w:spacing w:after="40"/>
+            </w:pPr>
+            <w:r>
+              <w:t>このGUIの直接入力ではない。</w:t>
+            </w:r>
+          </w:p>
+        </w:tc>
+      </w:tr>
+      <w:tr>
+        <w:tc>
+          <w:tcPr>
+            <w:tcW w:type="dxa" w:w="1900"/>
+          </w:tcPr>
+          <w:p>
+            <w:pPr>
+              <w:spacing w:after="40"/>
+            </w:pPr>
+            <w:r>
+              <w:t>2. IgBLAST AIRR</w:t>
+            </w:r>
+          </w:p>
+        </w:tc>
+        <w:tc>
+          <w:tcPr>
+            <w:tcW w:type="dxa" w:w="4200"/>
+          </w:tcPr>
+          <w:p>
+            <w:pPr>
+              <w:spacing w:after="40"/>
+            </w:pPr>
+            <w:r>
+              <w:t>マージ済み配列をIgBLAST -outfmt 19でAIRR TSVにする。</w:t>
+            </w:r>
+          </w:p>
+        </w:tc>
+        <w:tc>
+          <w:tcPr>
+            <w:tcW w:type="dxa" w:w="3260"/>
+          </w:tcPr>
+          <w:p>
+            <w:pPr>
+              <w:spacing w:after="40"/>
+            </w:pPr>
+            <w:r>
+              <w:t>*.igblast.airr.tsv</w:t>
+            </w:r>
+          </w:p>
+        </w:tc>
+      </w:tr>
+      <w:tr>
+        <w:tc>
+          <w:tcPr>
+            <w:tcW w:type="dxa" w:w="1900"/>
+          </w:tcPr>
+          <w:p>
+            <w:pPr>
+              <w:spacing w:after="40"/>
+            </w:pPr>
+            <w:r>
+              <w:t>3. filter</w:t>
+            </w:r>
+          </w:p>
+        </w:tc>
+        <w:tc>
+          <w:tcPr>
+            <w:tcW w:type="dxa" w:w="4200"/>
+          </w:tcPr>
+          <w:p>
+            <w:pPr>
+              <w:spacing w:after="40"/>
+            </w:pPr>
+            <w:r>
+              <w:t>productive, locus, junction, junction_aa等で採用行を決める。</w:t>
+            </w:r>
+          </w:p>
+        </w:tc>
+        <w:tc>
+          <w:tcPr>
+            <w:tcW w:type="dxa" w:w="3260"/>
+          </w:tcPr>
+          <w:p>
+            <w:pPr>
+              <w:spacing w:after="40"/>
+            </w:pPr>
+            <w:r>
+              <w:t>QC summaryに除外件数を記録。</w:t>
+            </w:r>
+          </w:p>
+        </w:tc>
+      </w:tr>
+      <w:tr>
+        <w:tc>
+          <w:tcPr>
+            <w:tcW w:type="dxa" w:w="1900"/>
+          </w:tcPr>
+          <w:p>
+            <w:pPr>
+              <w:spacing w:after="40"/>
+            </w:pPr>
+            <w:r>
+              <w:t>4. row-level Excel/TSV</w:t>
+            </w:r>
+          </w:p>
+        </w:tc>
+        <w:tc>
+          <w:tcPr>
+            <w:tcW w:type="dxa" w:w="4200"/>
+          </w:tcPr>
+          <w:p>
+            <w:pPr>
+              <w:spacing w:after="40"/>
+            </w:pPr>
+            <w:r>
+              <w:t>採用AIRR各行を潰さず、sequence_idごとにpGenとSHMを付与する。</w:t>
+            </w:r>
+          </w:p>
+        </w:tc>
+        <w:tc>
+          <w:tcPr>
+            <w:tcW w:type="dxa" w:w="3260"/>
+          </w:tcPr>
+          <w:p>
+            <w:pPr>
+              <w:spacing w:after="40"/>
+            </w:pPr>
+            <w:r>
+              <w:t>*_pgen_shm_rows.xlsx / *_pgen_shm_points.tsv</w:t>
+            </w:r>
+          </w:p>
+        </w:tc>
+      </w:tr>
+      <w:tr>
+        <w:tc>
+          <w:tcPr>
+            <w:tcW w:type="dxa" w:w="1900"/>
+          </w:tcPr>
+          <w:p>
+            <w:pPr>
+              <w:spacing w:after="40"/>
+            </w:pPr>
+            <w:r>
+              <w:t>5. plots/tables</w:t>
+            </w:r>
+          </w:p>
+        </w:tc>
+        <w:tc>
+          <w:tcPr>
+            <w:tcW w:type="dxa" w:w="4200"/>
+          </w:tcPr>
+          <w:p>
+            <w:pPr>
+              <w:spacing w:after="40"/>
+            </w:pPr>
+            <w:r>
+              <w:t>中心データからscatter, KDE, log-density, Beta1互換, ROI summaryを作る。</w:t>
+            </w:r>
+          </w:p>
+        </w:tc>
+        <w:tc>
+          <w:tcPr>
+            <w:tcW w:type="dxa" w:w="3260"/>
+          </w:tcPr>
+          <w:p>
+            <w:pPr>
+              <w:spacing w:after="40"/>
+            </w:pPr>
+            <w:r>
+              <w:t>複数の見方を併用して解釈。</w:t>
+            </w:r>
+          </w:p>
+        </w:tc>
+      </w:tr>
+    </w:tbl>
+    <w:p/>
+    <w:tbl>
+      <w:tblPr>
+        <w:tblStyle w:val="TableGrid"/>
+        <w:tblW w:type="dxa" w:w="9360"/>
+        <w:tblLayout w:type="fixed"/>
+        <w:tblLook w:firstColumn="1" w:firstRow="1" w:lastColumn="0" w:lastRow="0" w:noHBand="0" w:noVBand="1" w:val="04A0"/>
+        <w:tblInd w:w="120" w:type="dxa"/>
+        <w:tblCellMar>
+          <w:top w:w="80" w:type="dxa"/>
+          <w:start w:w="120" w:type="dxa"/>
+          <w:bottom w:w="80" w:type="dxa"/>
+          <w:end w:w="120" w:type="dxa"/>
+        </w:tblCellMar>
+      </w:tblPr>
+      <w:tblGrid>
+        <w:gridCol w:w="1900"/>
+        <w:gridCol w:w="4300"/>
+        <w:gridCol w:w="3160"/>
+      </w:tblGrid>
+      <w:tr>
+        <w:tc>
+          <w:tcPr>
+            <w:tcW w:type="dxa" w:w="1900"/>
+            <w:vAlign w:val="center"/>
+            <w:shd w:fill="E8EEF5"/>
+          </w:tcPr>
+          <w:p>
+            <w:pPr>
+              <w:jc w:val="center"/>
+            </w:pPr>
+            <w:r>
+              <w:rPr>
+                <w:b/>
+                <w:color w:val="0B2545"/>
+              </w:rPr>
+              <w:t>フィルタ</w:t>
+            </w:r>
+          </w:p>
+        </w:tc>
+        <w:tc>
+          <w:tcPr>
+            <w:tcW w:type="dxa" w:w="4300"/>
+            <w:vAlign w:val="center"/>
+            <w:shd w:fill="E8EEF5"/>
+          </w:tcPr>
+          <w:p>
+            <w:pPr>
+              <w:jc w:val="center"/>
+            </w:pPr>
+            <w:r>
+              <w:rPr>
+                <w:b/>
+                <w:color w:val="0B2545"/>
+              </w:rPr>
+              <w:t>採用条件</w:t>
+            </w:r>
+          </w:p>
+        </w:tc>
+        <w:tc>
+          <w:tcPr>
+            <w:tcW w:type="dxa" w:w="3160"/>
+            <w:vAlign w:val="center"/>
+            <w:shd w:fill="E8EEF5"/>
+          </w:tcPr>
+          <w:p>
+            <w:pPr>
+              <w:jc w:val="center"/>
+            </w:pPr>
+            <w:r>
+              <w:rPr>
+                <w:b/>
+                <w:color w:val="0B2545"/>
+              </w:rPr>
+              <w:t>補足</w:t>
+            </w:r>
+          </w:p>
+        </w:tc>
+      </w:tr>
+      <w:tr>
+        <w:tc>
+          <w:tcPr>
+            <w:tcW w:type="dxa" w:w="1900"/>
+          </w:tcPr>
+          <w:p>
+            <w:pPr>
+              <w:spacing w:after="40"/>
+            </w:pPr>
+            <w:r>
+              <w:t>locus</w:t>
+            </w:r>
+          </w:p>
+        </w:tc>
+        <w:tc>
+          <w:tcPr>
+            <w:tcW w:type="dxa" w:w="4300"/>
+          </w:tcPr>
+          <w:p>
+            <w:pPr>
+              <w:spacing w:after="40"/>
+            </w:pPr>
+            <w:r>
+              <w:t>基本はIGH。locus列がありIGH以外なら除外。空欄locusは保持しQCに記録。</w:t>
+            </w:r>
+          </w:p>
+        </w:tc>
+        <w:tc>
+          <w:tcPr>
+            <w:tcW w:type="dxa" w:w="3160"/>
+          </w:tcPr>
+          <w:p>
+            <w:pPr>
+              <w:spacing w:after="40"/>
+            </w:pPr>
+            <w:r>
+              <w:t>OLGA human_B_heavyを使うため。</w:t>
+            </w:r>
+          </w:p>
+        </w:tc>
+      </w:tr>
+      <w:tr>
+        <w:tc>
+          <w:tcPr>
+            <w:tcW w:type="dxa" w:w="1900"/>
+          </w:tcPr>
+          <w:p>
+            <w:pPr>
+              <w:spacing w:after="40"/>
+            </w:pPr>
+            <w:r>
+              <w:t>productive</w:t>
+            </w:r>
+          </w:p>
+        </w:tc>
+        <w:tc>
+          <w:tcPr>
+            <w:tcW w:type="dxa" w:w="4300"/>
+          </w:tcPr>
+          <w:p>
+            <w:pPr>
+              <w:spacing w:after="40"/>
+            </w:pPr>
+            <w:r>
+              <w:t>productive == Tを採用。</w:t>
+            </w:r>
+          </w:p>
+        </w:tc>
+        <w:tc>
+          <w:tcPr>
+            <w:tcW w:type="dxa" w:w="3160"/>
+          </w:tcPr>
+          <w:p>
+            <w:pPr>
+              <w:spacing w:after="40"/>
+            </w:pPr>
+            <w:r>
+              <w:t>非productive配列を除外。</w:t>
+            </w:r>
+          </w:p>
+        </w:tc>
+      </w:tr>
+      <w:tr>
+        <w:tc>
+          <w:tcPr>
+            <w:tcW w:type="dxa" w:w="1900"/>
+          </w:tcPr>
+          <w:p>
+            <w:pPr>
+              <w:spacing w:after="40"/>
+            </w:pPr>
+            <w:r>
+              <w:t>vj_in_frame</w:t>
+            </w:r>
+          </w:p>
+        </w:tc>
+        <w:tc>
+          <w:tcPr>
+            <w:tcW w:type="dxa" w:w="4300"/>
+          </w:tcPr>
+          <w:p>
+            <w:pPr>
+              <w:spacing w:after="40"/>
+            </w:pPr>
+            <w:r>
+              <w:t>列がある場合はTを採用。</w:t>
+            </w:r>
+          </w:p>
+        </w:tc>
+        <w:tc>
+          <w:tcPr>
+            <w:tcW w:type="dxa" w:w="3160"/>
+          </w:tcPr>
+          <w:p>
+            <w:pPr>
+              <w:spacing w:after="40"/>
+            </w:pPr>
+            <w:r>
+              <w:t>列がない場合はこの条件は適用しない。</w:t>
+            </w:r>
+          </w:p>
+        </w:tc>
+      </w:tr>
+      <w:tr>
+        <w:tc>
+          <w:tcPr>
+            <w:tcW w:type="dxa" w:w="1900"/>
+          </w:tcPr>
+          <w:p>
+            <w:pPr>
+              <w:spacing w:after="40"/>
+            </w:pPr>
+            <w:r>
+              <w:t>stop_codon</w:t>
+            </w:r>
+          </w:p>
+        </w:tc>
+        <w:tc>
+          <w:tcPr>
+            <w:tcW w:type="dxa" w:w="4300"/>
+          </w:tcPr>
+          <w:p>
+            <w:pPr>
+              <w:spacing w:after="40"/>
+            </w:pPr>
+            <w:r>
+              <w:t>列がある場合はFを採用。</w:t>
+            </w:r>
+          </w:p>
+        </w:tc>
+        <w:tc>
+          <w:tcPr>
+            <w:tcW w:type="dxa" w:w="3160"/>
+          </w:tcPr>
+          <w:p>
+            <w:pPr>
+              <w:spacing w:after="40"/>
+            </w:pPr>
+            <w:r>
+              <w:t>停止コドンを持つ配列を除外。</w:t>
+            </w:r>
+          </w:p>
+        </w:tc>
+      </w:tr>
+      <w:tr>
+        <w:tc>
+          <w:tcPr>
+            <w:tcW w:type="dxa" w:w="1900"/>
+          </w:tcPr>
+          <w:p>
+            <w:pPr>
+              <w:spacing w:after="40"/>
+            </w:pPr>
+            <w:r>
+              <w:t>junction nt</w:t>
+            </w:r>
+          </w:p>
+        </w:tc>
+        <w:tc>
+          <w:tcPr>
+            <w:tcW w:type="dxa" w:w="4300"/>
+          </w:tcPr>
+          <w:p>
+            <w:pPr>
+              <w:spacing w:after="40"/>
+            </w:pPr>
+            <w:r>
+              <w:t>空欄でなくA/C/G/Tのみ。Nや記号を含むものは除外。</w:t>
+            </w:r>
+          </w:p>
+        </w:tc>
+        <w:tc>
+          <w:tcPr>
+            <w:tcW w:type="dxa" w:w="3160"/>
+          </w:tcPr>
+          <w:p>
+            <w:pPr>
+              <w:spacing w:after="40"/>
+            </w:pPr>
+            <w:r>
+              <w:t>Beta1互換集計とjunction品質確認のため。</w:t>
+            </w:r>
+          </w:p>
+        </w:tc>
+      </w:tr>
+      <w:tr>
+        <w:tc>
+          <w:tcPr>
+            <w:tcW w:type="dxa" w:w="1900"/>
+          </w:tcPr>
+          <w:p>
+            <w:pPr>
+              <w:spacing w:after="40"/>
+            </w:pPr>
+            <w:r>
+              <w:t>junction_aa</w:t>
+            </w:r>
+          </w:p>
+        </w:tc>
+        <w:tc>
+          <w:tcPr>
+            <w:tcW w:type="dxa" w:w="4300"/>
+          </w:tcPr>
+          <w:p>
+            <w:pPr>
+              <w:spacing w:after="40"/>
+            </w:pPr>
+            <w:r>
+              <w:t>空欄でなく、*やXを含まない英字。</w:t>
+            </w:r>
+          </w:p>
+        </w:tc>
+        <w:tc>
+          <w:tcPr>
+            <w:tcW w:type="dxa" w:w="3160"/>
+          </w:tcPr>
+          <w:p>
+            <w:pPr>
+              <w:spacing w:after="40"/>
+            </w:pPr>
+            <w:r>
+              <w:t>pGen計算に不適なAAを除外。</w:t>
+            </w:r>
+          </w:p>
+        </w:tc>
+      </w:tr>
+      <w:tr>
+        <w:tc>
+          <w:tcPr>
+            <w:tcW w:type="dxa" w:w="1900"/>
+          </w:tcPr>
+          <w:p>
+            <w:pPr>
+              <w:spacing w:after="40"/>
+            </w:pPr>
+            <w:r>
+              <w:t>junction_aa canonical</w:t>
+            </w:r>
+          </w:p>
+        </w:tc>
+        <w:tc>
+          <w:tcPr>
+            <w:tcW w:type="dxa" w:w="4300"/>
+          </w:tcPr>
+          <w:p>
+            <w:pPr>
+              <w:spacing w:after="40"/>
+            </w:pPr>
+            <w:r>
+              <w:t>先頭C、末尾W/Fは現行の必須条件ではない。</w:t>
+            </w:r>
+          </w:p>
+        </w:tc>
+        <w:tc>
+          <w:tcPr>
+            <w:tcW w:type="dxa" w:w="3160"/>
+          </w:tcPr>
+          <w:p>
+            <w:pPr>
+              <w:spacing w:after="40"/>
+            </w:pPr>
+            <w:r>
+              <w:t>マージ済み配列由来AIRRでは非canonicalも残し、pGen=0等として確認する。</w:t>
+            </w:r>
+          </w:p>
+        </w:tc>
+      </w:tr>
+      <w:tr>
+        <w:tc>
+          <w:tcPr>
+            <w:tcW w:type="dxa" w:w="1900"/>
+          </w:tcPr>
+          <w:p>
+            <w:pPr>
+              <w:spacing w:after="40"/>
+            </w:pPr>
+            <w:r>
+              <w:t>V alignment length</w:t>
+            </w:r>
+          </w:p>
+        </w:tc>
+        <w:tc>
+          <w:tcPr>
+            <w:tcW w:type="dxa" w:w="4300"/>
+          </w:tcPr>
+          <w:p>
+            <w:pPr>
+              <w:spacing w:after="40"/>
+            </w:pPr>
+            <w:r>
+              <w:t>既定では下限0。GUIでMin V alignment lengthを設定した場合のみ除外。</w:t>
+            </w:r>
+          </w:p>
+        </w:tc>
+        <w:tc>
+          <w:tcPr>
+            <w:tcW w:type="dxa" w:w="3160"/>
+          </w:tcPr>
+          <w:p>
+            <w:pPr>
+              <w:spacing w:after="40"/>
+            </w:pPr>
+            <w:r>
+              <w:t>短いV alignment由来SHMの感度解析用。</w:t>
+            </w:r>
+          </w:p>
+        </w:tc>
+      </w:tr>
+    </w:tbl>
+    <w:p/>
+    <w:p>
+      <w:pPr>
+        <w:pStyle w:val="Heading1"/>
+      </w:pPr>
+      <w:r>
+        <w:rPr>
+          <w:color w:val="2E74B5"/>
+        </w:rPr>
+        <w:t>9. pGen=0の扱いと意味</w:t>
+      </w:r>
+    </w:p>
+    <w:p>
+      <w:r>
+        <w:t>pGen=0は、OLGA human_B_heavyモデル上でそのjunction_aaの生成確率が0、またはモデル外として扱われることを意味する。これは「生成されやすい」方向ではなく、最も生成されにくい側である。log10(pGen)が計算できないためplotからは除外するが、採用row-level Excel/TSVには残し、件数をrun logやQCで確認できるようにする。</w:t>
+      </w:r>
+    </w:p>
+    <w:p>
+      <w:pPr>
+        <w:pStyle w:val="ListBullet"/>
+        <w:spacing w:after="80"/>
+      </w:pPr>
+      <w:r>
+        <w:t>pGenは大きいほど生成されやすい。例: 1e-10は1e-20より生成されやすい。</w:t>
+      </w:r>
+    </w:p>
+    <w:p>
+      <w:pPr>
+        <w:pStyle w:val="ListBullet"/>
+        <w:spacing w:after="80"/>
+      </w:pPr>
+      <w:r>
+        <w:t>pGen=0は概念的にはlog10(pGen) = -infinity側であり、2D plotのx軸に置けない。</w:t>
+      </w:r>
+    </w:p>
+    <w:p>
+      <w:pPr>
+        <w:pStyle w:val="ListBullet"/>
+        <w:spacing w:after="80"/>
+      </w:pPr>
+      <w:r>
+        <w:t>我々の出力済みデータではrow-levelで約0.27%がpGen=0であり、plot全体への影響は小さい。</w:t>
+      </w:r>
+    </w:p>
+    <w:p>
+      <w:pPr>
+        <w:pStyle w:val="ListBullet"/>
+        <w:spacing w:after="80"/>
+      </w:pPr>
+      <w:r>
+        <w:t>pGen=0例には、junction_aaの先頭がCでない、末尾がW/Fでない、または極端に長い配列が多い。</w:t>
+      </w:r>
+    </w:p>
+    <w:p>
+      <w:pPr>
+        <w:pStyle w:val="ListBullet"/>
+        <w:spacing w:after="80"/>
+      </w:pPr>
+      <w:r>
+        <w:t>非canonical junction_aaは直ちに削除せず、探索段階では中間表に残して後から確認できるようにする。</w:t>
+      </w:r>
+    </w:p>
     <w:sectPr>
       <w:footerReference w:type="default" r:id="rId9"/>
       <w:pgSz w:w="12240" w:h="15840"/>

</xml_diff>

<commit_message>
Clarify productive filter hierarchy
</commit_message>
<xml_diff>
--- a/TSVからpGen-SHMデータ作成仕様書_20260607.docx
+++ b/TSVからpGen-SHMデータ作成仕様書_20260607.docx
@@ -1738,6 +1738,11 @@
         <w:t>現在の解析フローは、マージした配列からIgBLAST AIRR TSVを作成し、そのAIRR TSVにフィルタを適用した後、採用row-level Excel/TSVを中心データとして保存する流れである。FASTAを本GUIへ直接入れるのではなく、前段でAIRR TSV化済みのデータを入力する。</w:t>
       </w:r>
     </w:p>
+    <w:p>
+      <w:r>
+        <w:t>productiveはIgBLAST/AIRRの総合判定であり、V-Jがin-frameであること、stop codonを含まないこと等を反映する。したがって、vj_in_frameとstop_codonはproductiveとは独立した別概念の主フィルタではなく、AIRR TSVに列がある場合だけproductive判定の内訳を補助確認し、矛盾行を除くための安全確認として扱う。</w:t>
+      </w:r>
+    </w:p>
     <w:tbl>
       <w:tblPr>
         <w:tblStyle w:val="TableGrid"/>
@@ -2161,11 +2166,8 @@
             <w:tcW w:type="dxa" w:w="4300"/>
           </w:tcPr>
           <w:p>
-            <w:pPr>
-              <w:spacing w:after="40"/>
-            </w:pPr>
             <w:r>
-              <w:t>productive == Tを採用。</w:t>
+              <w:t>productive == Tを主条件として採用。</w:t>
             </w:r>
           </w:p>
         </w:tc>
@@ -2174,11 +2176,8 @@
             <w:tcW w:type="dxa" w:w="3160"/>
           </w:tcPr>
           <w:p>
-            <w:pPr>
-              <w:spacing w:after="40"/>
-            </w:pPr>
             <w:r>
-              <w:t>非productive配列を除外。</w:t>
+              <w:t>IgBLAST/AIRRの総合判定。V-J in-frame、stop codonなし等を反映するため、下記2条件は補助確認として扱う。</w:t>
             </w:r>
           </w:p>
         </w:tc>
@@ -2202,11 +2201,8 @@
             <w:tcW w:type="dxa" w:w="4300"/>
           </w:tcPr>
           <w:p>
-            <w:pPr>
-              <w:spacing w:after="40"/>
-            </w:pPr>
             <w:r>
-              <w:t>列がある場合はTを採用。</w:t>
+              <w:t>列がある場合のみTを採用。</w:t>
             </w:r>
           </w:p>
         </w:tc>
@@ -2215,11 +2211,8 @@
             <w:tcW w:type="dxa" w:w="3160"/>
           </w:tcPr>
           <w:p>
-            <w:pPr>
-              <w:spacing w:after="40"/>
-            </w:pPr>
             <w:r>
-              <w:t>列がない場合はこの条件は適用しない。</w:t>
+              <w:t>productive判定の内訳確認。列がない場合はこの条件を適用しない。</w:t>
             </w:r>
           </w:p>
         </w:tc>
@@ -2243,11 +2236,8 @@
             <w:tcW w:type="dxa" w:w="4300"/>
           </w:tcPr>
           <w:p>
-            <w:pPr>
-              <w:spacing w:after="40"/>
-            </w:pPr>
             <w:r>
-              <w:t>列がある場合はFを採用。</w:t>
+              <w:t>列がある場合のみFまたはFalseを採用。</w:t>
             </w:r>
           </w:p>
         </w:tc>
@@ -2256,11 +2246,8 @@
             <w:tcW w:type="dxa" w:w="3160"/>
           </w:tcPr>
           <w:p>
-            <w:pPr>
-              <w:spacing w:after="40"/>
-            </w:pPr>
             <w:r>
-              <w:t>停止コドンを持つ配列を除外。</w:t>
+              <w:t>productive判定の内訳確認。列がない場合はこの条件を適用しない。</w:t>
             </w:r>
           </w:p>
         </w:tc>

</xml_diff>